<commit_message>
refactor: queue logic and fix login/UI issues
</commit_message>
<xml_diff>
--- a/TourGuide_PRD.docx
+++ b/TourGuide_PRD.docx
@@ -5993,17 +5993,7 @@
       </w:r>
     </w:p>
     <w:p>
-      <w:pPr>
-        <w:rPr>
-          <w:b/>
-          <w:bCs/>
-        </w:rPr>
-      </w:pPr>
-      <w:r>
-        <w:rPr>
-          <w:b/>
-          <w:bCs/>
-        </w:rPr>
+      <w:r>
         <w:t>3.1.1. App</w:t>
       </w:r>
     </w:p>
@@ -6079,17 +6069,7 @@
       </w:pPr>
     </w:p>
     <w:p>
-      <w:pPr>
-        <w:rPr>
-          <w:b/>
-          <w:bCs/>
-        </w:rPr>
-      </w:pPr>
-      <w:r>
-        <w:rPr>
-          <w:b/>
-          <w:bCs/>
-        </w:rPr>
+      <w:r>
         <w:t>3.1.2. Web</w:t>
       </w:r>
     </w:p>
@@ -6157,32 +6137,19 @@
     </w:p>
     <w:p>
       <w:pPr>
-        <w:rPr>
-          <w:b/>
-          <w:bCs/>
-        </w:rPr>
-      </w:pPr>
-      <w:r>
-        <w:rPr>
-          <w:b/>
-          <w:bCs/>
-        </w:rPr>
+        <w:pStyle w:val="Heading3"/>
+        <w:rPr>
+          <w:b w:val="0"/>
+          <w:bCs w:val="0"/>
+        </w:rPr>
+      </w:pPr>
+      <w:r>
         <w:lastRenderedPageBreak/>
         <w:t>3.2. Đăng ký</w:t>
       </w:r>
     </w:p>
     <w:p>
-      <w:pPr>
-        <w:rPr>
-          <w:b/>
-          <w:bCs/>
-        </w:rPr>
-      </w:pPr>
-      <w:r>
-        <w:rPr>
-          <w:b/>
-          <w:bCs/>
-        </w:rPr>
+      <w:r>
         <w:t>3.2.1. App</w:t>
       </w:r>
     </w:p>
@@ -6256,17 +6223,7 @@
       </w:pPr>
     </w:p>
     <w:p>
-      <w:pPr>
-        <w:rPr>
-          <w:b/>
-          <w:bCs/>
-        </w:rPr>
-      </w:pPr>
-      <w:r>
-        <w:rPr>
-          <w:b/>
-          <w:bCs/>
-        </w:rPr>
+      <w:r>
         <w:t>3.2.2. Web</w:t>
       </w:r>
     </w:p>
@@ -6341,31 +6298,18 @@
     </w:p>
     <w:p>
       <w:pPr>
-        <w:rPr>
-          <w:b/>
-          <w:bCs/>
-        </w:rPr>
-      </w:pPr>
-      <w:r>
-        <w:rPr>
-          <w:b/>
-          <w:bCs/>
-        </w:rPr>
+        <w:pStyle w:val="Heading3"/>
+        <w:rPr>
+          <w:b w:val="0"/>
+          <w:bCs w:val="0"/>
+        </w:rPr>
+      </w:pPr>
+      <w:r>
         <w:t>3.3. Nhóm Customer (Người dùng)</w:t>
       </w:r>
     </w:p>
     <w:p>
-      <w:pPr>
-        <w:rPr>
-          <w:b/>
-          <w:bCs/>
-        </w:rPr>
-      </w:pPr>
-      <w:r>
-        <w:rPr>
-          <w:b/>
-          <w:bCs/>
-        </w:rPr>
+      <w:r>
         <w:t>3.3.1. Khám phá POI theo vị trí &amp; bản đồ</w:t>
       </w:r>
     </w:p>
@@ -6440,17 +6384,7 @@
       </w:pPr>
     </w:p>
     <w:p>
-      <w:pPr>
-        <w:rPr>
-          <w:b/>
-          <w:bCs/>
-        </w:rPr>
-      </w:pPr>
-      <w:r>
-        <w:rPr>
-          <w:b/>
-          <w:bCs/>
-        </w:rPr>
+      <w:r>
         <w:t>3.3.2. Xem chi tiết POI &amp; thuyết minh</w:t>
       </w:r>
     </w:p>
@@ -6524,17 +6458,7 @@
       </w:pPr>
     </w:p>
     <w:p>
-      <w:pPr>
-        <w:rPr>
-          <w:b/>
-          <w:bCs/>
-        </w:rPr>
-      </w:pPr>
-      <w:r>
-        <w:rPr>
-          <w:b/>
-          <w:bCs/>
-        </w:rPr>
+      <w:r>
         <w:t>3.3.3. Quét mã QR &amp; Tự động thuyết minh</w:t>
       </w:r>
     </w:p>
@@ -6701,45 +6625,24 @@
     </w:p>
     <w:p>
       <w:pPr>
-        <w:rPr>
-          <w:b/>
-          <w:bCs/>
-        </w:rPr>
-      </w:pPr>
-      <w:r>
-        <w:rPr>
-          <w:b/>
-          <w:bCs/>
-        </w:rPr>
+        <w:pStyle w:val="Heading3"/>
+        <w:rPr>
+          <w:b w:val="0"/>
+          <w:bCs w:val="0"/>
+        </w:rPr>
+      </w:pPr>
+      <w:r>
         <w:t>3.4. Nhóm Owner</w:t>
       </w:r>
     </w:p>
     <w:p>
-      <w:pPr>
-        <w:rPr>
-          <w:b/>
-          <w:bCs/>
-        </w:rPr>
-      </w:pPr>
-      <w:r>
-        <w:rPr>
-          <w:b/>
-          <w:bCs/>
-        </w:rPr>
+      <w:r>
         <w:t>3.4.1</w:t>
       </w:r>
       <w:r>
-        <w:rPr>
-          <w:b/>
-          <w:bCs/>
-        </w:rPr>
         <w:t>.</w:t>
       </w:r>
       <w:r>
-        <w:rPr>
-          <w:b/>
-          <w:bCs/>
-        </w:rPr>
         <w:t xml:space="preserve"> Tạo/Chỉnh sửa POI</w:t>
       </w:r>
     </w:p>
@@ -6814,17 +6717,7 @@
       </w:pPr>
     </w:p>
     <w:p>
-      <w:pPr>
-        <w:rPr>
-          <w:b/>
-          <w:bCs/>
-        </w:rPr>
-      </w:pPr>
-      <w:r>
-        <w:rPr>
-          <w:b/>
-          <w:bCs/>
-        </w:rPr>
+      <w:r>
         <w:t>3.4.2. Quản lý hình ảnh POI</w:t>
       </w:r>
     </w:p>
@@ -6899,31 +6792,13 @@
       </w:pPr>
     </w:p>
     <w:p>
-      <w:pPr>
-        <w:rPr>
-          <w:b/>
-          <w:bCs/>
-        </w:rPr>
-      </w:pPr>
-      <w:r>
-        <w:rPr>
-          <w:b/>
-          <w:bCs/>
-        </w:rPr>
+      <w:r>
         <w:t>3.4.3</w:t>
       </w:r>
       <w:r>
-        <w:rPr>
-          <w:b/>
-          <w:bCs/>
-        </w:rPr>
         <w:t>.</w:t>
       </w:r>
       <w:r>
-        <w:rPr>
-          <w:b/>
-          <w:bCs/>
-        </w:rPr>
         <w:t xml:space="preserve"> Quản lý kịch bản Audio</w:t>
       </w:r>
     </w:p>
@@ -6998,17 +6873,7 @@
       </w:pPr>
     </w:p>
     <w:p>
-      <w:pPr>
-        <w:rPr>
-          <w:b/>
-          <w:bCs/>
-        </w:rPr>
-      </w:pPr>
-      <w:r>
-        <w:rPr>
-          <w:b/>
-          <w:bCs/>
-        </w:rPr>
+      <w:r>
         <w:t>3.4.4 Gửi yêu cầu Vào/Ra Tour</w:t>
       </w:r>
     </w:p>
@@ -7084,45 +6949,24 @@
     </w:p>
     <w:p>
       <w:pPr>
-        <w:rPr>
-          <w:b/>
-          <w:bCs/>
-        </w:rPr>
-      </w:pPr>
-      <w:r>
-        <w:rPr>
-          <w:b/>
-          <w:bCs/>
-        </w:rPr>
+        <w:pStyle w:val="Heading3"/>
+        <w:rPr>
+          <w:b w:val="0"/>
+          <w:bCs w:val="0"/>
+        </w:rPr>
+      </w:pPr>
+      <w:r>
         <w:t>3.5. Nhóm Admin</w:t>
       </w:r>
     </w:p>
     <w:p>
-      <w:pPr>
-        <w:rPr>
-          <w:b/>
-          <w:bCs/>
-        </w:rPr>
-      </w:pPr>
-      <w:r>
-        <w:rPr>
-          <w:b/>
-          <w:bCs/>
-        </w:rPr>
+      <w:r>
         <w:t>3.5.1</w:t>
       </w:r>
       <w:r>
-        <w:rPr>
-          <w:b/>
-          <w:bCs/>
-        </w:rPr>
         <w:t>.</w:t>
       </w:r>
       <w:r>
-        <w:rPr>
-          <w:b/>
-          <w:bCs/>
-        </w:rPr>
         <w:t xml:space="preserve"> Phê duyệt nội dung (POI &amp; Tour)</w:t>
       </w:r>
     </w:p>
@@ -7197,31 +7041,13 @@
       </w:pPr>
     </w:p>
     <w:p>
-      <w:pPr>
-        <w:rPr>
-          <w:b/>
-          <w:bCs/>
-        </w:rPr>
-      </w:pPr>
-      <w:r>
-        <w:rPr>
-          <w:b/>
-          <w:bCs/>
-        </w:rPr>
+      <w:r>
         <w:t>3.5.2</w:t>
       </w:r>
       <w:r>
-        <w:rPr>
-          <w:b/>
-          <w:bCs/>
-        </w:rPr>
         <w:t>.</w:t>
       </w:r>
       <w:r>
-        <w:rPr>
-          <w:b/>
-          <w:bCs/>
-        </w:rPr>
         <w:t xml:space="preserve"> Quản lý Tour và Lộ trình</w:t>
       </w:r>
     </w:p>
@@ -7296,31 +7122,13 @@
       </w:pPr>
     </w:p>
     <w:p>
-      <w:pPr>
-        <w:rPr>
-          <w:b/>
-          <w:bCs/>
-        </w:rPr>
-      </w:pPr>
-      <w:r>
-        <w:rPr>
-          <w:b/>
-          <w:bCs/>
-        </w:rPr>
+      <w:r>
         <w:t>3.5.3</w:t>
       </w:r>
       <w:r>
-        <w:rPr>
-          <w:b/>
-          <w:bCs/>
-        </w:rPr>
         <w:t>.</w:t>
       </w:r>
       <w:r>
-        <w:rPr>
-          <w:b/>
-          <w:bCs/>
-        </w:rPr>
         <w:t xml:space="preserve"> Quản lý Người dùng</w:t>
       </w:r>
     </w:p>
@@ -7395,17 +7203,7 @@
       </w:pPr>
     </w:p>
     <w:p>
-      <w:pPr>
-        <w:rPr>
-          <w:b/>
-          <w:bCs/>
-        </w:rPr>
-      </w:pPr>
-      <w:r>
-        <w:rPr>
-          <w:b/>
-          <w:bCs/>
-        </w:rPr>
+      <w:r>
         <w:t>3.5.4. Quản lý Ngôn ngữ hệ thống</w:t>
       </w:r>
     </w:p>
@@ -7480,17 +7278,7 @@
       </w:pPr>
     </w:p>
     <w:p>
-      <w:pPr>
-        <w:rPr>
-          <w:b/>
-          <w:bCs/>
-        </w:rPr>
-      </w:pPr>
-      <w:r>
-        <w:rPr>
-          <w:b/>
-          <w:bCs/>
-        </w:rPr>
+      <w:r>
         <w:t>3.5.5 Thống kê và Báo cáo</w:t>
       </w:r>
     </w:p>
@@ -7566,45 +7354,31 @@
     </w:p>
     <w:p>
       <w:pPr>
-        <w:rPr>
-          <w:b/>
-          <w:bCs/>
-        </w:rPr>
-      </w:pPr>
-      <w:r>
-        <w:rPr>
-          <w:b/>
-          <w:bCs/>
-        </w:rPr>
+        <w:pStyle w:val="Heading2"/>
+        <w:rPr>
+          <w:b w:val="0"/>
+          <w:bCs w:val="0"/>
+        </w:rPr>
+      </w:pPr>
+      <w:r>
         <w:t>4. State diagram</w:t>
       </w:r>
     </w:p>
     <w:p>
       <w:pPr>
-        <w:rPr>
-          <w:b/>
-          <w:bCs/>
-        </w:rPr>
-      </w:pPr>
-      <w:r>
-        <w:rPr>
-          <w:b/>
-          <w:bCs/>
-        </w:rPr>
+        <w:pStyle w:val="Heading3"/>
+        <w:rPr>
+          <w:b w:val="0"/>
+          <w:bCs w:val="0"/>
+        </w:rPr>
+      </w:pPr>
+      <w:r>
         <w:t>4.1</w:t>
       </w:r>
       <w:r>
-        <w:rPr>
-          <w:b/>
-          <w:bCs/>
-        </w:rPr>
         <w:t>.</w:t>
       </w:r>
       <w:r>
-        <w:rPr>
-          <w:b/>
-          <w:bCs/>
-        </w:rPr>
         <w:t xml:space="preserve"> POI State (Điểm tham quan)</w:t>
       </w:r>
     </w:p>
@@ -7668,24 +7442,16 @@
     </w:p>
     <w:p>
       <w:pPr>
-        <w:pStyle w:val="NoSpacing"/>
-        <w:rPr>
-          <w:b/>
-          <w:bCs/>
-        </w:rPr>
-      </w:pPr>
-      <w:r>
-        <w:rPr>
-          <w:b/>
-          <w:bCs/>
-        </w:rPr>
+        <w:pStyle w:val="Heading3"/>
+        <w:rPr>
+          <w:b w:val="0"/>
+          <w:bCs w:val="0"/>
+        </w:rPr>
+      </w:pPr>
+      <w:r>
         <w:t xml:space="preserve">4.2. </w:t>
       </w:r>
       <w:r>
-        <w:rPr>
-          <w:b/>
-          <w:bCs/>
-        </w:rPr>
         <w:t>TourPOI State (Lộ trình Tour)</w:t>
       </w:r>
     </w:p>
@@ -7698,6 +7464,7 @@
         <w:rPr>
           <w:noProof/>
         </w:rPr>
+        <w:lastRenderedPageBreak/>
         <w:drawing>
           <wp:inline distT="0" distB="0" distL="0" distR="0" wp14:anchorId="04BC3124" wp14:editId="76FF6B31">
             <wp:extent cx="4142218" cy="4434840"/>
@@ -7746,24 +7513,16 @@
     </w:p>
     <w:p>
       <w:pPr>
-        <w:pStyle w:val="NoSpacing"/>
-        <w:rPr>
-          <w:b/>
-          <w:bCs/>
-        </w:rPr>
-      </w:pPr>
-      <w:r>
-        <w:rPr>
-          <w:b/>
-          <w:bCs/>
-        </w:rPr>
+        <w:pStyle w:val="Heading3"/>
+        <w:rPr>
+          <w:b w:val="0"/>
+          <w:bCs w:val="0"/>
+        </w:rPr>
+      </w:pPr>
+      <w:r>
         <w:t>4.3.</w:t>
       </w:r>
       <w:r>
-        <w:rPr>
-          <w:b/>
-          <w:bCs/>
-        </w:rPr>
         <w:t xml:space="preserve"> Tour state</w:t>
       </w:r>
     </w:p>
@@ -7776,6 +7535,7 @@
         <w:rPr>
           <w:noProof/>
         </w:rPr>
+        <w:lastRenderedPageBreak/>
         <w:drawing>
           <wp:inline distT="0" distB="0" distL="0" distR="0" wp14:anchorId="4B6461CD" wp14:editId="39156147">
             <wp:extent cx="3413760" cy="4598814"/>
@@ -7815,17 +7575,13 @@
     </w:p>
     <w:p>
       <w:pPr>
-        <w:pStyle w:val="NoSpacing"/>
-        <w:rPr>
-          <w:b/>
-          <w:bCs/>
-        </w:rPr>
-      </w:pPr>
-      <w:r>
-        <w:rPr>
-          <w:b/>
-          <w:bCs/>
-        </w:rPr>
+        <w:pStyle w:val="Heading3"/>
+        <w:rPr>
+          <w:b w:val="0"/>
+          <w:bCs w:val="0"/>
+        </w:rPr>
+      </w:pPr>
+      <w:r>
         <w:t>4.4. Language State (Ngôn ngữ)</w:t>
       </w:r>
     </w:p>
@@ -7890,74 +7646,42 @@
     </w:p>
     <w:p>
       <w:pPr>
-        <w:rPr>
-          <w:b/>
-          <w:bCs/>
-        </w:rPr>
-      </w:pPr>
-      <w:r>
-        <w:rPr>
-          <w:b/>
-          <w:bCs/>
-        </w:rPr>
+        <w:pStyle w:val="Heading2"/>
+        <w:rPr>
+          <w:b w:val="0"/>
+          <w:bCs w:val="0"/>
+        </w:rPr>
+      </w:pPr>
+      <w:r>
         <w:t xml:space="preserve">5. </w:t>
       </w:r>
       <w:r>
-        <w:rPr>
-          <w:b/>
-          <w:bCs/>
-        </w:rPr>
         <w:t>Activity diagram</w:t>
       </w:r>
     </w:p>
     <w:p>
       <w:pPr>
-        <w:rPr>
-          <w:b/>
-          <w:bCs/>
-        </w:rPr>
-      </w:pPr>
-      <w:r>
-        <w:rPr>
-          <w:b/>
-          <w:bCs/>
-        </w:rPr>
+        <w:pStyle w:val="Heading3"/>
+        <w:rPr>
+          <w:b w:val="0"/>
+          <w:bCs w:val="0"/>
+        </w:rPr>
+      </w:pPr>
+      <w:r>
         <w:t xml:space="preserve">5.1. </w:t>
       </w:r>
       <w:r>
-        <w:rPr>
-          <w:b/>
-          <w:bCs/>
-        </w:rPr>
         <w:t>Nhóm Khách du lịch (Customer - App Maui)</w:t>
       </w:r>
     </w:p>
     <w:p>
-      <w:pPr>
-        <w:rPr>
-          <w:b/>
-          <w:bCs/>
-        </w:rPr>
-      </w:pPr>
-      <w:r>
-        <w:rPr>
-          <w:b/>
-          <w:bCs/>
-        </w:rPr>
+      <w:r>
         <w:t>5.1</w:t>
       </w:r>
       <w:r>
-        <w:rPr>
-          <w:b/>
-          <w:bCs/>
-        </w:rPr>
         <w:t xml:space="preserve">.1. </w:t>
       </w:r>
       <w:r>
-        <w:rPr>
-          <w:b/>
-          <w:bCs/>
-        </w:rPr>
         <w:t>Khám phá địa điểm &amp; Thuyết minh tự động:</w:t>
       </w:r>
     </w:p>
@@ -8132,53 +7856,28 @@
     </w:p>
     <w:p>
       <w:pPr>
-        <w:rPr>
-          <w:b/>
-          <w:bCs/>
-        </w:rPr>
-      </w:pPr>
-      <w:r>
-        <w:rPr>
-          <w:b/>
-          <w:bCs/>
-        </w:rPr>
+        <w:pStyle w:val="Heading3"/>
+        <w:rPr>
+          <w:b w:val="0"/>
+          <w:bCs w:val="0"/>
+        </w:rPr>
+      </w:pPr>
+      <w:r>
         <w:lastRenderedPageBreak/>
         <w:t xml:space="preserve">5.2. </w:t>
       </w:r>
       <w:r>
-        <w:rPr>
-          <w:b/>
-          <w:bCs/>
-        </w:rPr>
         <w:t>Nhóm Chủ nội dung (Owner - Web Management)</w:t>
       </w:r>
     </w:p>
     <w:p>
-      <w:pPr>
-        <w:rPr>
-          <w:b/>
-          <w:bCs/>
-        </w:rPr>
-      </w:pPr>
-      <w:r>
-        <w:rPr>
-          <w:b/>
-          <w:bCs/>
-        </w:rPr>
+      <w:r>
         <w:t>5.</w:t>
       </w:r>
       <w:r>
-        <w:rPr>
-          <w:b/>
-          <w:bCs/>
-        </w:rPr>
         <w:t>2.1.</w:t>
       </w:r>
       <w:r>
-        <w:rPr>
-          <w:b/>
-          <w:bCs/>
-        </w:rPr>
         <w:t xml:space="preserve"> Đăng ký &amp; Quản lý POI (Kèm kiểm duyệt)</w:t>
       </w:r>
     </w:p>
@@ -8293,6 +7992,7 @@
         <w:rPr>
           <w:noProof/>
         </w:rPr>
+        <w:lastRenderedPageBreak/>
         <w:drawing>
           <wp:inline distT="0" distB="0" distL="0" distR="0" wp14:anchorId="203FBA5E" wp14:editId="368E39DC">
             <wp:extent cx="5465705" cy="4152900"/>
@@ -8345,6 +8045,32 @@
     </w:p>
     <w:p>
       <w:pPr>
+        <w:pStyle w:val="Heading3"/>
+        <w:rPr>
+          <w:b w:val="0"/>
+          <w:bCs w:val="0"/>
+        </w:rPr>
+      </w:pPr>
+      <w:r>
+        <w:t xml:space="preserve">5.3. </w:t>
+      </w:r>
+      <w:r>
+        <w:t>Nhóm Quản trị viên (Admin - Web Management)</w:t>
+      </w:r>
+    </w:p>
+    <w:p>
+      <w:r>
+        <w:t>5.</w:t>
+      </w:r>
+      <w:r>
+        <w:t>3.1.</w:t>
+      </w:r>
+      <w:r>
+        <w:t xml:space="preserve"> Phê duyệt nội dung &amp; Quản lý Tour</w:t>
+      </w:r>
+    </w:p>
+    <w:p>
+      <w:pPr>
         <w:rPr>
           <w:b/>
           <w:bCs/>
@@ -8352,60 +8078,9 @@
       </w:pPr>
       <w:r>
         <w:rPr>
-          <w:b/>
-          <w:bCs/>
+          <w:noProof/>
         </w:rPr>
         <w:lastRenderedPageBreak/>
-        <w:t xml:space="preserve">5.3. </w:t>
-      </w:r>
-      <w:r>
-        <w:rPr>
-          <w:b/>
-          <w:bCs/>
-        </w:rPr>
-        <w:t>Nhóm Quản trị viên (Admin - Web Management)</w:t>
-      </w:r>
-    </w:p>
-    <w:p>
-      <w:pPr>
-        <w:rPr>
-          <w:b/>
-          <w:bCs/>
-        </w:rPr>
-      </w:pPr>
-      <w:r>
-        <w:rPr>
-          <w:b/>
-          <w:bCs/>
-        </w:rPr>
-        <w:t>5.</w:t>
-      </w:r>
-      <w:r>
-        <w:rPr>
-          <w:b/>
-          <w:bCs/>
-        </w:rPr>
-        <w:t>3.1.</w:t>
-      </w:r>
-      <w:r>
-        <w:rPr>
-          <w:b/>
-          <w:bCs/>
-        </w:rPr>
-        <w:t xml:space="preserve"> Phê duyệt nội dung &amp; Quản lý Tour</w:t>
-      </w:r>
-    </w:p>
-    <w:p>
-      <w:pPr>
-        <w:rPr>
-          <w:b/>
-          <w:bCs/>
-        </w:rPr>
-      </w:pPr>
-      <w:r>
-        <w:rPr>
-          <w:noProof/>
-        </w:rPr>
         <w:drawing>
           <wp:inline distT="0" distB="0" distL="0" distR="0" wp14:anchorId="6E7BDDAA" wp14:editId="757FA0CC">
             <wp:extent cx="5760085" cy="4901025"/>
@@ -8465,18 +8140,14 @@
       </w:pPr>
     </w:p>
     <w:p>
-      <w:pPr>
-        <w:rPr>
-          <w:b/>
-          <w:bCs/>
-        </w:rPr>
-      </w:pPr>
-      <w:r>
-        <w:rPr>
-          <w:b/>
-          <w:bCs/>
-        </w:rPr>
-        <w:t>5.6 Thiết lập lộ trình Tour (Sắp xếp POI)</w:t>
+      <w:r>
+        <w:t>5.</w:t>
+      </w:r>
+      <w:r>
+        <w:t>3.2</w:t>
+      </w:r>
+      <w:r>
+        <w:t xml:space="preserve"> Thiết lập lộ trình Tour (Sắp xếp POI)</w:t>
       </w:r>
     </w:p>
     <w:p>

</xml_diff>